<commit_message>
add column in template and customer quality and tech support screen checkin
</commit_message>
<xml_diff>
--- a/APLOS/POPResources/Templates/LocalTaxInvoice202034.docx
+++ b/APLOS/POPResources/Templates/LocalTaxInvoice202034.docx
@@ -332,6 +332,7 @@
               </w:rPr>
               <w:t xml:space="preserve"> </w:t>
             </w:r>
+            <w:proofErr w:type="gramStart"/>
             <w:r>
               <w:rPr>
                 <w:rFonts w:ascii="Tahoma" w:hAnsi="Tahoma" w:cs="Tahoma"/>
@@ -342,6 +343,7 @@
               </w:rPr>
               <w:t>PH:-</w:t>
             </w:r>
+            <w:proofErr w:type="gramEnd"/>
             <w:r>
               <w:rPr>
                 <w:rFonts w:ascii="Tahoma" w:hAnsi="Tahoma" w:cs="Tahoma"/>
@@ -429,7 +431,27 @@
                 <w:sz w:val="16"/>
                 <w:szCs w:val="16"/>
               </w:rPr>
-              <w:t>GST NO : 03AAJCC0212A1ZR</w:t>
+              <w:t xml:space="preserve">GST </w:t>
+            </w:r>
+            <w:proofErr w:type="gramStart"/>
+            <w:r>
+              <w:rPr>
+                <w:rFonts w:ascii="Tahoma" w:hAnsi="Tahoma" w:cs="Tahoma"/>
+                <w:b/>
+                <w:sz w:val="16"/>
+                <w:szCs w:val="16"/>
+              </w:rPr>
+              <w:t>NO :</w:t>
+            </w:r>
+            <w:proofErr w:type="gramEnd"/>
+            <w:r>
+              <w:rPr>
+                <w:rFonts w:ascii="Tahoma" w:hAnsi="Tahoma" w:cs="Tahoma"/>
+                <w:b/>
+                <w:sz w:val="16"/>
+                <w:szCs w:val="16"/>
+              </w:rPr>
+              <w:t xml:space="preserve"> 03AAJCC0212A1ZR</w:t>
             </w:r>
           </w:p>
         </w:tc>
@@ -759,6 +781,7 @@
               <w:t xml:space="preserve">Customer </w:t>
             </w:r>
             <w:proofErr w:type="spellStart"/>
+            <w:proofErr w:type="gramStart"/>
             <w:r>
               <w:rPr>
                 <w:rFonts w:ascii="Tahoma" w:hAnsi="Tahoma" w:cs="Tahoma"/>
@@ -796,6 +819,7 @@
               </w:rPr>
               <w:t>:-</w:t>
             </w:r>
+            <w:proofErr w:type="gramEnd"/>
             <w:r>
               <w:rPr>
                 <w:rFonts w:ascii="Tahoma" w:hAnsi="Tahoma" w:cs="Tahoma"/>
@@ -857,7 +881,27 @@
                 <w:sz w:val="16"/>
                 <w:szCs w:val="16"/>
               </w:rPr>
-              <w:t>PAN NO :-</w:t>
+              <w:t xml:space="preserve">PAN </w:t>
+            </w:r>
+            <w:proofErr w:type="gramStart"/>
+            <w:r>
+              <w:rPr>
+                <w:rFonts w:ascii="Tahoma" w:hAnsi="Tahoma" w:cs="Tahoma"/>
+                <w:b/>
+                <w:sz w:val="16"/>
+                <w:szCs w:val="16"/>
+              </w:rPr>
+              <w:t>NO :</w:t>
+            </w:r>
+            <w:proofErr w:type="gramEnd"/>
+            <w:r>
+              <w:rPr>
+                <w:rFonts w:ascii="Tahoma" w:hAnsi="Tahoma" w:cs="Tahoma"/>
+                <w:b/>
+                <w:sz w:val="16"/>
+                <w:szCs w:val="16"/>
+              </w:rPr>
+              <w:t>-</w:t>
             </w:r>
             <w:r>
               <w:rPr>
@@ -1339,8 +1383,19 @@
                 <w:sz w:val="16"/>
                 <w:szCs w:val="16"/>
               </w:rPr>
-              <w:t>Container No :</w:t>
-            </w:r>
+              <w:t xml:space="preserve">Container </w:t>
+            </w:r>
+            <w:proofErr w:type="gramStart"/>
+            <w:r>
+              <w:rPr>
+                <w:rFonts w:ascii="Tahoma" w:hAnsi="Tahoma" w:cs="Tahoma"/>
+                <w:b/>
+                <w:sz w:val="16"/>
+                <w:szCs w:val="16"/>
+              </w:rPr>
+              <w:t>No :</w:t>
+            </w:r>
+            <w:proofErr w:type="gramEnd"/>
             <w:r>
               <w:rPr>
                 <w:rFonts w:ascii="Tahoma" w:hAnsi="Tahoma" w:cs="Tahoma"/>
@@ -1387,6 +1442,44 @@
                 <w:szCs w:val="16"/>
               </w:rPr>
             </w:pPr>
+            <w:proofErr w:type="gramStart"/>
+            <w:r>
+              <w:rPr>
+                <w:rFonts w:ascii="Tahoma" w:hAnsi="Tahoma" w:cs="Tahoma"/>
+                <w:b/>
+                <w:sz w:val="16"/>
+                <w:szCs w:val="16"/>
+              </w:rPr>
+              <w:t>Type :</w:t>
+            </w:r>
+            <w:proofErr w:type="gramEnd"/>
+            <w:r>
+              <w:rPr>
+                <w:rFonts w:ascii="Tahoma" w:hAnsi="Tahoma" w:cs="Tahoma"/>
+                <w:b/>
+                <w:sz w:val="16"/>
+                <w:szCs w:val="16"/>
+              </w:rPr>
+              <w:t xml:space="preserve"> {</w:t>
+            </w:r>
+            <w:r>
+              <w:rPr>
+                <w:rFonts w:ascii="Tahoma" w:hAnsi="Tahoma" w:cs="Tahoma"/>
+                <w:bCs/>
+                <w:sz w:val="16"/>
+                <w:szCs w:val="16"/>
+              </w:rPr>
+              <w:t>Type</w:t>
+            </w:r>
+            <w:r>
+              <w:rPr>
+                <w:rFonts w:ascii="Tahoma" w:hAnsi="Tahoma" w:cs="Tahoma"/>
+                <w:b/>
+                <w:sz w:val="16"/>
+                <w:szCs w:val="16"/>
+              </w:rPr>
+              <w:t>}</w:t>
+            </w:r>
           </w:p>
         </w:tc>
       </w:tr>
@@ -1681,6 +1774,7 @@
               </w:rPr>
               <w:t xml:space="preserve">Transport Doc </w:t>
             </w:r>
+            <w:proofErr w:type="gramStart"/>
             <w:r>
               <w:rPr>
                 <w:rFonts w:ascii="Tahoma" w:hAnsi="Tahoma" w:cs="Tahoma"/>
@@ -1702,6 +1796,7 @@
               <w:t>{</w:t>
             </w:r>
             <w:proofErr w:type="spellStart"/>
+            <w:proofErr w:type="gramEnd"/>
             <w:r>
               <w:rPr>
                 <w:rFonts w:ascii="Consolas" w:hAnsi="Consolas" w:cs="Consolas"/>
@@ -2071,6 +2166,7 @@
                 <w:szCs w:val="16"/>
               </w:rPr>
             </w:pPr>
+            <w:proofErr w:type="gramStart"/>
             <w:r>
               <w:rPr>
                 <w:rFonts w:ascii="Tahoma" w:eastAsia="Arial" w:hAnsi="Tahoma" w:cs="Tahoma"/>
@@ -2079,7 +2175,18 @@
                 <w:sz w:val="16"/>
                 <w:szCs w:val="16"/>
               </w:rPr>
-              <w:t>Total : {</w:t>
+              <w:t>Total :</w:t>
+            </w:r>
+            <w:proofErr w:type="gramEnd"/>
+            <w:r>
+              <w:rPr>
+                <w:rFonts w:ascii="Tahoma" w:eastAsia="Arial" w:hAnsi="Tahoma" w:cs="Tahoma"/>
+                <w:b/>
+                <w:bCs/>
+                <w:sz w:val="16"/>
+                <w:szCs w:val="16"/>
+              </w:rPr>
+              <w:t xml:space="preserve"> {</w:t>
             </w:r>
             <w:proofErr w:type="spellStart"/>
             <w:r>
@@ -3117,12 +3224,6 @@
             <w:szCs w:val="14"/>
           </w:rPr>
           <w:tab/>
-        </w:r>
-        <w:r>
-          <w:rPr>
-            <w:sz w:val="14"/>
-            <w:szCs w:val="14"/>
-          </w:rPr>
           <w:t>Created By: {</w:t>
         </w:r>
         <w:proofErr w:type="spellStart"/>

</xml_diff>